<commit_message>
docs: add Intellect Pro demo script; point sales demo links to /login
New demo-meeting script (accounts, step-by-step, what-not-to-show, close).
Sales kit demo links now go to /login since / is the public landing.

Co-Authored-By: Claude Opus 4.7 (1M context) <noreply@anthropic.com>
</commit_message>
<xml_diff>
--- a/docs/Bilim_OS_скрипт_продаж.docx
+++ b/docs/Bilim_OS_скрипт_продаж.docx
@@ -311,7 +311,7 @@
           <w:sz w:val="20"/>
           <w:szCs w:val="20"/>
         </w:rPr>
-        <w:t xml:space="preserve">Демо: </w:t>
+        <w:t xml:space="preserve">Демо (вход): </w:t>
       </w:r>
       <w:r>
         <w:rPr>
@@ -321,7 +321,7 @@
           <w:sz w:val="20"/>
           <w:szCs w:val="20"/>
         </w:rPr>
-        <w:t xml:space="preserve">https://erudit-school.vercel.app · пароль erudit2025 · логины azhibaeva (учитель), kozlova (завуч), parent1 (родитель).</w:t>
+        <w:t xml:space="preserve">https://erudit-school.vercel.app/login · пароль erudit2025 · логины azhibaeva (учитель), kozlova (завуч), parent1 (родитель). На сайте https://erudit-school.vercel.app — кнопка «Смотреть демо».</w:t>
       </w:r>
     </w:p>
     <w:p>

</xml_diff>